<commit_message>
fix: corregir numeracion de pasos en Manual de usuario y anexos del documento de entrega; añadir PDF para imprimir
</commit_message>
<xml_diff>
--- a/DOCUMENTO_ENTREGA_FINAL.docx
+++ b/DOCUMENTO_ENTREGA_FINAL.docx
@@ -4015,6 +4015,10 @@
     <w:p>
       <w:pPr>
         <w:pStyle w:val="ListNumber"/>
+        <w:numPr>
+          <w:ilvl w:val="0"/>
+          <w:numId w:val="200"/>
+        </w:numPr>
       </w:pPr>
       <w:r>
         <w:t xml:space="preserve">Abrir </w:t>
@@ -4030,6 +4034,10 @@
     <w:p>
       <w:pPr>
         <w:pStyle w:val="ListNumber"/>
+        <w:numPr>
+          <w:ilvl w:val="0"/>
+          <w:numId w:val="200"/>
+        </w:numPr>
       </w:pPr>
       <w:r>
         <w:t>Clic en "Entrar" (esquina superior derecha)</w:t>
@@ -4038,6 +4046,10 @@
     <w:p>
       <w:pPr>
         <w:pStyle w:val="ListNumber"/>
+        <w:numPr>
+          <w:ilvl w:val="0"/>
+          <w:numId w:val="200"/>
+        </w:numPr>
       </w:pPr>
       <w:r>
         <w:t>Seleccionar "Crear cuenta"</w:t>
@@ -4046,6 +4058,10 @@
     <w:p>
       <w:pPr>
         <w:pStyle w:val="ListNumber"/>
+        <w:numPr>
+          <w:ilvl w:val="0"/>
+          <w:numId w:val="200"/>
+        </w:numPr>
       </w:pPr>
       <w:r>
         <w:t>Rellenar usuario, email y contraseña (mín. 8 caracteres, mayúsculas y número)</w:t>
@@ -4054,6 +4070,10 @@
     <w:p>
       <w:pPr>
         <w:pStyle w:val="ListNumber"/>
+        <w:numPr>
+          <w:ilvl w:val="0"/>
+          <w:numId w:val="200"/>
+        </w:numPr>
       </w:pPr>
       <w:r>
         <w:t>Aceptar las condiciones y confirmar</w:t>
@@ -4073,6 +4093,10 @@
     <w:p>
       <w:pPr>
         <w:pStyle w:val="ListNumber"/>
+        <w:numPr>
+          <w:ilvl w:val="0"/>
+          <w:numId w:val="201"/>
+        </w:numPr>
       </w:pPr>
       <w:r>
         <w:t>Clic en "Estudio" en el menú</w:t>
@@ -4081,6 +4105,10 @@
     <w:p>
       <w:pPr>
         <w:pStyle w:val="ListNumber"/>
+        <w:numPr>
+          <w:ilvl w:val="0"/>
+          <w:numId w:val="201"/>
+        </w:numPr>
       </w:pPr>
       <w:r>
         <w:t>Escribir la idea de la canción en el campo de texto (mín. 8 caracteres)</w:t>
@@ -4089,6 +4117,10 @@
     <w:p>
       <w:pPr>
         <w:pStyle w:val="ListNumber"/>
+        <w:numPr>
+          <w:ilvl w:val="0"/>
+          <w:numId w:val="201"/>
+        </w:numPr>
       </w:pPr>
       <w:r>
         <w:t>Opcionalmente, añadir un título (si se deja vacío se genera de las primeras palabras)</w:t>
@@ -4097,6 +4129,10 @@
     <w:p>
       <w:pPr>
         <w:pStyle w:val="ListNumber"/>
+        <w:numPr>
+          <w:ilvl w:val="0"/>
+          <w:numId w:val="201"/>
+        </w:numPr>
       </w:pPr>
       <w:r>
         <w:t>Seleccionar el género musical</w:t>
@@ -4105,6 +4141,10 @@
     <w:p>
       <w:pPr>
         <w:pStyle w:val="ListNumber"/>
+        <w:numPr>
+          <w:ilvl w:val="0"/>
+          <w:numId w:val="201"/>
+        </w:numPr>
       </w:pPr>
       <w:r>
         <w:t>Seleccionar el ánimo</w:t>
@@ -4113,6 +4153,10 @@
     <w:p>
       <w:pPr>
         <w:pStyle w:val="ListNumber"/>
+        <w:numPr>
+          <w:ilvl w:val="0"/>
+          <w:numId w:val="201"/>
+        </w:numPr>
       </w:pPr>
       <w:r>
         <w:t>Clic en "Componer"</w:t>
@@ -4121,6 +4165,10 @@
     <w:p>
       <w:pPr>
         <w:pStyle w:val="ListNumber"/>
+        <w:numPr>
+          <w:ilvl w:val="0"/>
+          <w:numId w:val="201"/>
+        </w:numPr>
       </w:pPr>
       <w:r>
         <w:t>La app genera la letra y guarda la canción automáticamente</w:t>
@@ -4140,6 +4188,10 @@
     <w:p>
       <w:pPr>
         <w:pStyle w:val="ListNumber"/>
+        <w:numPr>
+          <w:ilvl w:val="0"/>
+          <w:numId w:val="202"/>
+        </w:numPr>
       </w:pPr>
       <w:r>
         <w:t>Abrir una canción desde "Mi colección"</w:t>
@@ -4148,6 +4200,10 @@
     <w:p>
       <w:pPr>
         <w:pStyle w:val="ListNumber"/>
+        <w:numPr>
+          <w:ilvl w:val="0"/>
+          <w:numId w:val="202"/>
+        </w:numPr>
       </w:pPr>
       <w:r>
         <w:t>Pulsar el botón de reproducción</w:t>
@@ -4156,6 +4212,10 @@
     <w:p>
       <w:pPr>
         <w:pStyle w:val="ListNumber"/>
+        <w:numPr>
+          <w:ilvl w:val="0"/>
+          <w:numId w:val="202"/>
+        </w:numPr>
       </w:pPr>
       <w:r>
         <w:t>El navegador lee la letra línea a línea con la voz del sistema</w:t>
@@ -4175,6 +4235,10 @@
     <w:p>
       <w:pPr>
         <w:pStyle w:val="ListNumber"/>
+        <w:numPr>
+          <w:ilvl w:val="0"/>
+          <w:numId w:val="203"/>
+        </w:numPr>
       </w:pPr>
       <w:r>
         <w:t>Ir a "Descubrir"</w:t>
@@ -4183,6 +4247,10 @@
     <w:p>
       <w:pPr>
         <w:pStyle w:val="ListNumber"/>
+        <w:numPr>
+          <w:ilvl w:val="0"/>
+          <w:numId w:val="203"/>
+        </w:numPr>
       </w:pPr>
       <w:r>
         <w:t>Escribir un artista o canción en el buscador</w:t>
@@ -4191,6 +4259,10 @@
     <w:p>
       <w:pPr>
         <w:pStyle w:val="ListNumber"/>
+        <w:numPr>
+          <w:ilvl w:val="0"/>
+          <w:numId w:val="203"/>
+        </w:numPr>
       </w:pPr>
       <w:r>
         <w:t>Los resultados provienen de MusicBrainz en tiempo real</w:t>
@@ -4210,6 +4282,10 @@
     <w:p>
       <w:pPr>
         <w:pStyle w:val="ListNumber"/>
+        <w:numPr>
+          <w:ilvl w:val="0"/>
+          <w:numId w:val="204"/>
+        </w:numPr>
       </w:pPr>
       <w:r>
         <w:t>Ir a "Playlists"</w:t>
@@ -4218,6 +4294,10 @@
     <w:p>
       <w:pPr>
         <w:pStyle w:val="ListNumber"/>
+        <w:numPr>
+          <w:ilvl w:val="0"/>
+          <w:numId w:val="204"/>
+        </w:numPr>
       </w:pPr>
       <w:r>
         <w:t>Clic en "Nueva playlist", añadir título</w:t>
@@ -4226,6 +4306,10 @@
     <w:p>
       <w:pPr>
         <w:pStyle w:val="ListNumber"/>
+        <w:numPr>
+          <w:ilvl w:val="0"/>
+          <w:numId w:val="204"/>
+        </w:numPr>
       </w:pPr>
       <w:r>
         <w:t>Desde el detalle de una canción, añadirla a una playlist existente</w:t>
@@ -6853,6 +6937,10 @@
     <w:p>
       <w:pPr>
         <w:pStyle w:val="ListNumber"/>
+        <w:numPr>
+          <w:ilvl w:val="0"/>
+          <w:numId w:val="205"/>
+        </w:numPr>
       </w:pPr>
       <w:r>
         <w:t>Identificar el síntoma (error en consola, respuesta HTTP incorrecta, contenedor caído).</w:t>
@@ -6861,6 +6949,10 @@
     <w:p>
       <w:pPr>
         <w:pStyle w:val="ListNumber"/>
+        <w:numPr>
+          <w:ilvl w:val="0"/>
+          <w:numId w:val="205"/>
+        </w:numPr>
       </w:pPr>
       <w:r>
         <w:t xml:space="preserve">Comprobar logs: </w:t>
@@ -6879,6 +6971,10 @@
     <w:p>
       <w:pPr>
         <w:pStyle w:val="ListNumber"/>
+        <w:numPr>
+          <w:ilvl w:val="0"/>
+          <w:numId w:val="205"/>
+        </w:numPr>
       </w:pPr>
       <w:r>
         <w:t xml:space="preserve">Si es error PHP: revisar </w:t>
@@ -6897,6 +6993,10 @@
     <w:p>
       <w:pPr>
         <w:pStyle w:val="ListNumber"/>
+        <w:numPr>
+          <w:ilvl w:val="0"/>
+          <w:numId w:val="205"/>
+        </w:numPr>
       </w:pPr>
       <w:r>
         <w:t xml:space="preserve">Si es error de BD: comprobar que </w:t>
@@ -6925,6 +7025,10 @@
     <w:p>
       <w:pPr>
         <w:pStyle w:val="ListNumber"/>
+        <w:numPr>
+          <w:ilvl w:val="0"/>
+          <w:numId w:val="205"/>
+        </w:numPr>
       </w:pPr>
       <w:r>
         <w:t xml:space="preserve">Si el contenedor no responde: </w:t>
@@ -7920,6 +8024,42 @@
   <w:num w:numId="9">
     <w:abstractNumId w:val="0"/>
   </w:num>
+  <w:num w:numId="200">
+    <w:abstractNumId w:val="7"/>
+    <w:lvlOverride w:ilvl="0">
+      <w:startOverride w:val="1"/>
+    </w:lvlOverride>
+  </w:num>
+  <w:num w:numId="201">
+    <w:abstractNumId w:val="7"/>
+    <w:lvlOverride w:ilvl="0">
+      <w:startOverride w:val="1"/>
+    </w:lvlOverride>
+  </w:num>
+  <w:num w:numId="202">
+    <w:abstractNumId w:val="7"/>
+    <w:lvlOverride w:ilvl="0">
+      <w:startOverride w:val="1"/>
+    </w:lvlOverride>
+  </w:num>
+  <w:num w:numId="203">
+    <w:abstractNumId w:val="7"/>
+    <w:lvlOverride w:ilvl="0">
+      <w:startOverride w:val="1"/>
+    </w:lvlOverride>
+  </w:num>
+  <w:num w:numId="204">
+    <w:abstractNumId w:val="7"/>
+    <w:lvlOverride w:ilvl="0">
+      <w:startOverride w:val="1"/>
+    </w:lvlOverride>
+  </w:num>
+  <w:num w:numId="205">
+    <w:abstractNumId w:val="7"/>
+    <w:lvlOverride w:ilvl="0">
+      <w:startOverride w:val="1"/>
+    </w:lvlOverride>
+  </w:num>
 </w:numbering>
 </file>
 

</xml_diff>